<commit_message>
[T178] Informe de cierre regenerado con las cifras finales
Se regenera desde el repositorio, no se redacta a mano: las cifras salen de
Jest, de la API de SonarQube y de tasks.md, asi que son reproducibles.

Actualizado: 142 commits, 147 de 150 tareas, 1 564 pruebas en 92 archivos,
cobertura 84.0 % de sentencias y 85.4 % de lineas, 12 505 lineas analizadas,
20 migraciones. ZAP pasa a tres columnas: 18 -> 12 -> 6 tras el triaje.

Contenido nuevo:
- 2.3 lista los tres pendientes reales, no los de hace dos dias.
- 4.2 explica el triaje y por que el hallazgo medio se deja en aviso.
- 5.4, leccion nueva: medir antes que deducir. El fallo mas caro del proyecto
  —el modo claro a medias en Expo Go sobre Android— costo tres hipotesis
  encadenadas y se resolvio en media hora al instrumentar y leer el valor real.
  La causa era del sistema operativo, no del programa.

Co-Authored-By: Claude Opus 5 <noreply@anthropic.com>
</commit_message>
<xml_diff>
--- a/reports/Informe-de-cierre-KAVI.docx
+++ b/reports/Informe-de-cierre-KAVI.docx
@@ -127,7 +127,7 @@
           <w:sz w:val="21"/>
           <w:szCs w:val="21"/>
         </w:rPr>
-        <w:t xml:space="preserve">22 de septiembre de 2026</w:t>
+        <w:t xml:space="preserve">23 de septiembre de 2026</w:t>
       </w:r>
     </w:p>
     <w:p>
@@ -192,7 +192,7 @@
           <w:sz w:val="21"/>
           <w:szCs w:val="21"/>
         </w:rPr>
-        <w:t xml:space="preserve">El proyecto se desarrolló entre el 1 y el 22 de septiembre de 2026, en 116 commits, siguiendo un enfoque dirigido por especificaciones: cada funcionalidad se describió antes de implementarse, y el código se contrastó contra esa descripción.</w:t>
+        <w:t xml:space="preserve">El proyecto se desarrolló entre el 1 y el 23 de septiembre de 2026, en 142 commits, siguiendo un enfoque dirigido por especificaciones: cada funcionalidad se describió antes de implementarse, y el código se contrastó contra esa descripción.</w:t>
       </w:r>
     </w:p>
     <w:p>
@@ -339,7 +339,7 @@
                 <w:sz w:val="20"/>
                 <w:szCs w:val="20"/>
               </w:rPr>
-              <w:t xml:space="preserve">120 de 126 (95 %)</w:t>
+              <w:t xml:space="preserve">147 de 150 (98 %)</w:t>
             </w:r>
           </w:p>
         </w:tc>
@@ -395,7 +395,7 @@
                 <w:sz w:val="20"/>
                 <w:szCs w:val="20"/>
               </w:rPr>
-              <w:t xml:space="preserve">1 342, todas en verde</w:t>
+              <w:t xml:space="preserve">1 564, todas en verde</w:t>
             </w:r>
           </w:p>
         </w:tc>
@@ -451,7 +451,7 @@
                 <w:sz w:val="20"/>
                 <w:szCs w:val="20"/>
               </w:rPr>
-              <w:t xml:space="preserve">83.7 % sentencias · 85.2 % líneas</w:t>
+              <w:t xml:space="preserve">84.0 % sentencias · 85.4 % líneas</w:t>
             </w:r>
           </w:p>
         </w:tc>
@@ -619,7 +619,7 @@
                 <w:sz w:val="20"/>
                 <w:szCs w:val="20"/>
               </w:rPr>
-              <w:t xml:space="preserve">0.0 %</w:t>
+              <w:t xml:space="preserve">0.5 %</w:t>
             </w:r>
           </w:p>
         </w:tc>
@@ -675,7 +675,7 @@
                 <w:sz w:val="20"/>
                 <w:szCs w:val="20"/>
               </w:rPr>
-              <w:t xml:space="preserve">0</w:t>
+              <w:t xml:space="preserve">0 (6 en total, todos revisados)</w:t>
             </w:r>
           </w:p>
         </w:tc>
@@ -1864,7 +1864,7 @@
           <w:sz w:val="21"/>
           <w:szCs w:val="21"/>
         </w:rPr>
-        <w:t xml:space="preserve">Seis tareas de 126 permanecen sin cerrar. Se documentan por transparencia; ninguna bloquea el funcionamiento del sistema.</w:t>
+        <w:t xml:space="preserve">Tres tareas de 150 permanecen sin cerrar. Se documentan por transparencia; ninguna bloquea el funcionamiento del sistema.</w:t>
       </w:r>
     </w:p>
     <w:tbl>
@@ -1968,7 +1968,7 @@
                 <w:sz w:val="20"/>
                 <w:szCs w:val="20"/>
               </w:rPr>
-              <w:t xml:space="preserve">Distribución de iOS</w:t>
+              <w:t xml:space="preserve">Notificación del sistema verificada en dispositivo</w:t>
             </w:r>
           </w:p>
         </w:tc>
@@ -1995,7 +1995,7 @@
                 <w:sz w:val="20"/>
                 <w:szCs w:val="20"/>
               </w:rPr>
-              <w:t xml:space="preserve">Requiere cuenta de Apple Developer de pago (§3.4)</w:t>
+              <w:t xml:space="preserve">Requiere instalar una compilación nueva; el código está y funciona en la aplicación</w:t>
             </w:r>
           </w:p>
         </w:tc>
@@ -2024,7 +2024,7 @@
                 <w:sz w:val="20"/>
                 <w:szCs w:val="20"/>
               </w:rPr>
-              <w:t xml:space="preserve">Notificaciones del sistema</w:t>
+              <w:t xml:space="preserve">Matriz de pruebas manuales por funcionalidad</w:t>
             </w:r>
           </w:p>
         </w:tc>
@@ -2051,7 +2051,7 @@
                 <w:sz w:val="20"/>
                 <w:szCs w:val="20"/>
               </w:rPr>
-              <w:t xml:space="preserve">Incompatibilidad de biblioteca (§2.2)</w:t>
+              <w:t xml:space="preserve">Las pruebas automáticas cubren la lógica; falta el recorrido manual en las tres plataformas</w:t>
             </w:r>
           </w:p>
         </w:tc>
@@ -2080,7 +2080,7 @@
                 <w:sz w:val="20"/>
                 <w:szCs w:val="20"/>
               </w:rPr>
-              <w:t xml:space="preserve">Reporte de pruebas en cada despliegue</w:t>
+              <w:t xml:space="preserve">Hito final de la versión candidata</w:t>
             </w:r>
           </w:p>
         </w:tc>
@@ -2107,68 +2107,40 @@
                 <w:sz w:val="20"/>
                 <w:szCs w:val="20"/>
               </w:rPr>
-              <w:t xml:space="preserve">El reporte existe en el pipeline; falta enlazarlo al despliegue</w:t>
-            </w:r>
-          </w:p>
-        </w:tc>
-      </w:tr>
-      <w:tr>
-        <w:tc>
-          <w:tcPr>
-            <w:tcW w:type="dxa" w:w="3744"/>
-            <w:tcMar>
-              <w:top w:type="dxa" w:w="80"/>
-              <w:left w:type="dxa" w:w="120"/>
-              <w:bottom w:type="dxa" w:w="80"/>
-              <w:right w:type="dxa" w:w="120"/>
-            </w:tcMar>
-          </w:tcPr>
-          <w:p>
-            <w:pPr>
-              <w:spacing w:after="0" w:line="260"/>
-            </w:pPr>
-            <w:r>
-              <w:rPr>
-                <w:rFonts w:ascii="Calibri" w:cs="Calibri" w:eastAsia="Calibri" w:hAnsi="Calibri"/>
-                <w:b w:val="false"/>
-                <w:bCs w:val="false"/>
-                <w:color w:val="1A1A1A"/>
-                <w:sz w:val="20"/>
-                <w:szCs w:val="20"/>
-              </w:rPr>
-              <w:t xml:space="preserve">Pruebas automatizadas de RLS</w:t>
-            </w:r>
-          </w:p>
-        </w:tc>
-        <w:tc>
-          <w:tcPr>
-            <w:tcW w:type="dxa" w:w="5616"/>
-            <w:tcMar>
-              <w:top w:type="dxa" w:w="80"/>
-              <w:left w:type="dxa" w:w="120"/>
-              <w:bottom w:type="dxa" w:w="80"/>
-              <w:right w:type="dxa" w:w="120"/>
-            </w:tcMar>
-          </w:tcPr>
-          <w:p>
-            <w:pPr>
-              <w:spacing w:after="0" w:line="260"/>
-            </w:pPr>
-            <w:r>
-              <w:rPr>
-                <w:rFonts w:ascii="Calibri" w:cs="Calibri" w:eastAsia="Calibri" w:hAnsi="Calibri"/>
-                <w:b w:val="false"/>
-                <w:bCs w:val="false"/>
-                <w:color w:val="1A1A1A"/>
-                <w:sz w:val="20"/>
-                <w:szCs w:val="20"/>
-              </w:rPr>
-              <w:t xml:space="preserve">Las políticas están escritas y verificadas manualmente</w:t>
+              <w:t xml:space="preserve">Fijado al 26 de septiembre de 2026, posterior a este informe</w:t>
             </w:r>
           </w:p>
         </w:tc>
       </w:tr>
     </w:tbl>
+    <w:p>
+      <w:pPr>
+        <w:spacing w:after="120" w:line="276"/>
+      </w:pPr>
+      <w:r>
+        <w:rPr>
+          <w:rFonts w:ascii="Calibri" w:cs="Calibri" w:eastAsia="Calibri" w:hAnsi="Calibri"/>
+          <w:color w:val="1A1A1A"/>
+          <w:sz w:val="21"/>
+          <w:szCs w:val="21"/>
+        </w:rPr>
+        <w:t xml:space="preserve"/>
+      </w:r>
+    </w:p>
+    <w:p>
+      <w:pPr>
+        <w:spacing w:after="120" w:line="276"/>
+      </w:pPr>
+      <w:r>
+        <w:rPr>
+          <w:rFonts w:ascii="Calibri" w:cs="Calibri" w:eastAsia="Calibri" w:hAnsi="Calibri"/>
+          <w:color w:val="1A1A1A"/>
+          <w:sz w:val="21"/>
+          <w:szCs w:val="21"/>
+        </w:rPr>
+        <w:t xml:space="preserve">Aparte de estas, la distribución de iOS sigue bloqueada por un motivo administrativo y no de desarrollo (§3.4).</w:t>
+      </w:r>
+    </w:p>
     <w:p>
       <w:pPr>
         <w:pBdr>
@@ -2307,7 +2279,7 @@
           <w:sz w:val="21"/>
           <w:szCs w:val="21"/>
         </w:rPr>
-        <w:t xml:space="preserve">Toda tabla incorpora políticas de seguridad a nivel de fila (Row Level Security) desde su creación. Son 14 migraciones versionadas en el repositorio, cada una con sus políticas.</w:t>
+        <w:t xml:space="preserve">Toda tabla incorpora políticas de seguridad a nivel de fila (Row Level Security) desde su creación. Son 20 migraciones versionadas en el repositorio, cada una con sus políticas.</w:t>
       </w:r>
     </w:p>
     <w:p>
@@ -2498,7 +2470,7 @@
                 <w:sz w:val="20"/>
                 <w:szCs w:val="20"/>
               </w:rPr>
-              <w:t xml:space="preserve">83.7 %</w:t>
+              <w:t xml:space="preserve">84.0 %</w:t>
             </w:r>
           </w:p>
         </w:tc>
@@ -2525,7 +2497,7 @@
                 <w:sz w:val="20"/>
                 <w:szCs w:val="20"/>
               </w:rPr>
-              <w:t xml:space="preserve">2 871 de 3 431</w:t>
+              <w:t xml:space="preserve">3 266 de 3 888</w:t>
             </w:r>
           </w:p>
         </w:tc>
@@ -2581,7 +2553,7 @@
                 <w:sz w:val="20"/>
                 <w:szCs w:val="20"/>
               </w:rPr>
-              <w:t xml:space="preserve">85.2 %</w:t>
+              <w:t xml:space="preserve">85.4 %</w:t>
             </w:r>
           </w:p>
         </w:tc>
@@ -2608,7 +2580,7 @@
                 <w:sz w:val="20"/>
                 <w:szCs w:val="20"/>
               </w:rPr>
-              <w:t xml:space="preserve">2 470 de 2 899</w:t>
+              <w:t xml:space="preserve">2 793 de 3 270</w:t>
             </w:r>
           </w:p>
         </w:tc>
@@ -2664,7 +2636,7 @@
                 <w:sz w:val="20"/>
                 <w:szCs w:val="20"/>
               </w:rPr>
-              <w:t xml:space="preserve">77.9 %</w:t>
+              <w:t xml:space="preserve">78.4 %</w:t>
             </w:r>
           </w:p>
         </w:tc>
@@ -2691,7 +2663,7 @@
                 <w:sz w:val="20"/>
                 <w:szCs w:val="20"/>
               </w:rPr>
-              <w:t xml:space="preserve">1 919 de 2 463</w:t>
+              <w:t xml:space="preserve">2 227 de 2 840</w:t>
             </w:r>
           </w:p>
         </w:tc>
@@ -2747,7 +2719,7 @@
                 <w:sz w:val="20"/>
                 <w:szCs w:val="20"/>
               </w:rPr>
-              <w:t xml:space="preserve">78.4 %</w:t>
+              <w:t xml:space="preserve">78.9 %</w:t>
             </w:r>
           </w:p>
         </w:tc>
@@ -2774,7 +2746,7 @@
                 <w:sz w:val="20"/>
                 <w:szCs w:val="20"/>
               </w:rPr>
-              <w:t xml:space="preserve">970 de 1 237</w:t>
+              <w:t xml:space="preserve">1 079 de 1 367</w:t>
             </w:r>
           </w:p>
         </w:tc>
@@ -2805,7 +2777,7 @@
           <w:sz w:val="21"/>
           <w:szCs w:val="21"/>
         </w:rPr>
-        <w:t xml:space="preserve">Son 1 342 pruebas en 81 archivos, ejecutadas con Jest en unos 25 segundos. SonarQube publica una cifra distinta, 82.6 %, porque combina líneas y condiciones en un solo número; ambas superan el umbral.</w:t>
+        <w:t xml:space="preserve">Son 1 564 pruebas en 92 archivos, ejecutadas con Jest en unos 27 segundos. SonarQube publica una cifra distinta, 82.9 %, porque combina líneas y condiciones en un solo número; ambas superan el umbral.</w:t>
       </w:r>
     </w:p>
     <w:p>
@@ -3066,7 +3038,7 @@
                 <w:sz w:val="20"/>
                 <w:szCs w:val="20"/>
               </w:rPr>
-              <w:t xml:space="preserve">Tipos, 1 342 pruebas, lint y análisis de SonarQube</w:t>
+              <w:t xml:space="preserve">Tipos, 1 564 pruebas, lint y análisis de SonarQube</w:t>
             </w:r>
           </w:p>
         </w:tc>
@@ -3392,7 +3364,7 @@
           <w:sz w:val="21"/>
           <w:szCs w:val="21"/>
         </w:rPr>
-        <w:t xml:space="preserve">El análisis se ejecuta en cada integración y consume la cobertura de Jest. Resultados sobre 11 240 líneas de código:</w:t>
+        <w:t xml:space="preserve">El análisis se ejecuta en cada integración y consume la cobertura de Jest. Resultados sobre 12 505 líneas de código:</w:t>
       </w:r>
     </w:p>
     <w:tbl>
@@ -3747,7 +3719,7 @@
                 <w:sz w:val="20"/>
                 <w:szCs w:val="20"/>
               </w:rPr>
-              <w:t xml:space="preserve">0.0 %</w:t>
+              <w:t xml:space="preserve">0.5 %</w:t>
             </w:r>
           </w:p>
         </w:tc>
@@ -3803,7 +3775,7 @@
                 <w:sz w:val="20"/>
                 <w:szCs w:val="20"/>
               </w:rPr>
-              <w:t xml:space="preserve">82.6 %</w:t>
+              <w:t xml:space="preserve">82.9 %</w:t>
             </w:r>
           </w:p>
         </w:tc>
@@ -3859,7 +3831,7 @@
                 <w:sz w:val="20"/>
                 <w:szCs w:val="20"/>
               </w:rPr>
-              <w:t xml:space="preserve">2 501</w:t>
+              <w:t xml:space="preserve">2 828</w:t>
             </w:r>
           </w:p>
         </w:tc>
@@ -3915,7 +3887,7 @@
                 <w:sz w:val="20"/>
                 <w:szCs w:val="20"/>
               </w:rPr>
-              <w:t xml:space="preserve">1 293</w:t>
+              <w:t xml:space="preserve">1 494</w:t>
             </w:r>
           </w:p>
         </w:tc>
@@ -4205,8 +4177,9 @@
         </w:tblBorders>
       </w:tblPr>
       <w:tblGrid>
-        <w:gridCol w:w="3744"/>
         <w:gridCol w:w="2808"/>
+        <w:gridCol w:w="1872"/>
+        <w:gridCol w:w="1872"/>
         <w:gridCol w:w="2808"/>
       </w:tblGrid>
       <w:tr>
@@ -4215,7 +4188,7 @@
         </w:trPr>
         <w:tc>
           <w:tcPr>
-            <w:tcW w:type="dxa" w:w="3744"/>
+            <w:tcW w:type="dxa" w:w="2808"/>
             <w:shd w:fill="EDF1F7" w:val="clear"/>
             <w:tcMar>
               <w:top w:type="dxa" w:w="80"/>
@@ -4243,6 +4216,62 @@
         </w:tc>
         <w:tc>
           <w:tcPr>
+            <w:tcW w:type="dxa" w:w="1872"/>
+            <w:shd w:fill="EDF1F7" w:val="clear"/>
+            <w:tcMar>
+              <w:top w:type="dxa" w:w="80"/>
+              <w:left w:type="dxa" w:w="120"/>
+              <w:bottom w:type="dxa" w:w="80"/>
+              <w:right w:type="dxa" w:w="120"/>
+            </w:tcMar>
+          </w:tcPr>
+          <w:p>
+            <w:pPr>
+              <w:spacing w:after="0" w:line="260"/>
+            </w:pPr>
+            <w:r>
+              <w:rPr>
+                <w:rFonts w:ascii="Calibri" w:cs="Calibri" w:eastAsia="Calibri" w:hAnsi="Calibri"/>
+                <w:b/>
+                <w:bCs/>
+                <w:color w:val="1A1A1A"/>
+                <w:sz w:val="20"/>
+                <w:szCs w:val="20"/>
+              </w:rPr>
+              <w:t xml:space="preserve">Antes</w:t>
+            </w:r>
+          </w:p>
+        </w:tc>
+        <w:tc>
+          <w:tcPr>
+            <w:tcW w:type="dxa" w:w="1872"/>
+            <w:shd w:fill="EDF1F7" w:val="clear"/>
+            <w:tcMar>
+              <w:top w:type="dxa" w:w="80"/>
+              <w:left w:type="dxa" w:w="120"/>
+              <w:bottom w:type="dxa" w:w="80"/>
+              <w:right w:type="dxa" w:w="120"/>
+            </w:tcMar>
+          </w:tcPr>
+          <w:p>
+            <w:pPr>
+              <w:spacing w:after="0" w:line="260"/>
+            </w:pPr>
+            <w:r>
+              <w:rPr>
+                <w:rFonts w:ascii="Calibri" w:cs="Calibri" w:eastAsia="Calibri" w:hAnsi="Calibri"/>
+                <w:b/>
+                <w:bCs/>
+                <w:color w:val="1A1A1A"/>
+                <w:sz w:val="20"/>
+                <w:szCs w:val="20"/>
+              </w:rPr>
+              <w:t xml:space="preserve">Después</w:t>
+            </w:r>
+          </w:p>
+        </w:tc>
+        <w:tc>
+          <w:tcPr>
             <w:tcW w:type="dxa" w:w="2808"/>
             <w:shd w:fill="EDF1F7" w:val="clear"/>
             <w:tcMar>
@@ -4265,35 +4294,7 @@
                 <w:sz w:val="20"/>
                 <w:szCs w:val="20"/>
               </w:rPr>
-              <w:t xml:space="preserve">Antes</w:t>
-            </w:r>
-          </w:p>
-        </w:tc>
-        <w:tc>
-          <w:tcPr>
-            <w:tcW w:type="dxa" w:w="2808"/>
-            <w:shd w:fill="EDF1F7" w:val="clear"/>
-            <w:tcMar>
-              <w:top w:type="dxa" w:w="80"/>
-              <w:left w:type="dxa" w:w="120"/>
-              <w:bottom w:type="dxa" w:w="80"/>
-              <w:right w:type="dxa" w:w="120"/>
-            </w:tcMar>
-          </w:tcPr>
-          <w:p>
-            <w:pPr>
-              <w:spacing w:after="0" w:line="260"/>
-            </w:pPr>
-            <w:r>
-              <w:rPr>
-                <w:rFonts w:ascii="Calibri" w:cs="Calibri" w:eastAsia="Calibri" w:hAnsi="Calibri"/>
-                <w:b/>
-                <w:bCs/>
-                <w:color w:val="1A1A1A"/>
-                <w:sz w:val="20"/>
-                <w:szCs w:val="20"/>
-              </w:rPr>
-              <w:t xml:space="preserve">Después</w:t>
+              <w:t xml:space="preserve">Tras el triaje</w:t>
             </w:r>
           </w:p>
         </w:tc>
@@ -4301,7 +4302,7 @@
       <w:tr>
         <w:tc>
           <w:tcPr>
-            <w:tcW w:type="dxa" w:w="3744"/>
+            <w:tcW w:type="dxa" w:w="2808"/>
             <w:tcMar>
               <w:top w:type="dxa" w:w="80"/>
               <w:left w:type="dxa" w:w="120"/>
@@ -4328,7 +4329,34 @@
         </w:tc>
         <w:tc>
           <w:tcPr>
-            <w:tcW w:type="dxa" w:w="2808"/>
+            <w:tcW w:type="dxa" w:w="1872"/>
+            <w:tcMar>
+              <w:top w:type="dxa" w:w="80"/>
+              <w:left w:type="dxa" w:w="120"/>
+              <w:bottom w:type="dxa" w:w="80"/>
+              <w:right w:type="dxa" w:w="120"/>
+            </w:tcMar>
+          </w:tcPr>
+          <w:p>
+            <w:pPr>
+              <w:spacing w:after="0" w:line="260"/>
+            </w:pPr>
+            <w:r>
+              <w:rPr>
+                <w:rFonts w:ascii="Calibri" w:cs="Calibri" w:eastAsia="Calibri" w:hAnsi="Calibri"/>
+                <w:b w:val="false"/>
+                <w:bCs w:val="false"/>
+                <w:color w:val="1A1A1A"/>
+                <w:sz w:val="20"/>
+                <w:szCs w:val="20"/>
+              </w:rPr>
+              <w:t xml:space="preserve">0</w:t>
+            </w:r>
+          </w:p>
+        </w:tc>
+        <w:tc>
+          <w:tcPr>
+            <w:tcW w:type="dxa" w:w="1872"/>
             <w:tcMar>
               <w:top w:type="dxa" w:w="80"/>
               <w:left w:type="dxa" w:w="120"/>
@@ -4384,7 +4412,7 @@
       <w:tr>
         <w:tc>
           <w:tcPr>
-            <w:tcW w:type="dxa" w:w="3744"/>
+            <w:tcW w:type="dxa" w:w="2808"/>
             <w:tcMar>
               <w:top w:type="dxa" w:w="80"/>
               <w:left w:type="dxa" w:w="120"/>
@@ -4411,7 +4439,7 @@
         </w:tc>
         <w:tc>
           <w:tcPr>
-            <w:tcW w:type="dxa" w:w="2808"/>
+            <w:tcW w:type="dxa" w:w="1872"/>
             <w:tcMar>
               <w:top w:type="dxa" w:w="80"/>
               <w:left w:type="dxa" w:w="120"/>
@@ -4433,6 +4461,33 @@
                 <w:szCs w:val="20"/>
               </w:rPr>
               <w:t xml:space="preserve">3</w:t>
+            </w:r>
+          </w:p>
+        </w:tc>
+        <w:tc>
+          <w:tcPr>
+            <w:tcW w:type="dxa" w:w="1872"/>
+            <w:tcMar>
+              <w:top w:type="dxa" w:w="80"/>
+              <w:left w:type="dxa" w:w="120"/>
+              <w:bottom w:type="dxa" w:w="80"/>
+              <w:right w:type="dxa" w:w="120"/>
+            </w:tcMar>
+          </w:tcPr>
+          <w:p>
+            <w:pPr>
+              <w:spacing w:after="0" w:line="260"/>
+            </w:pPr>
+            <w:r>
+              <w:rPr>
+                <w:rFonts w:ascii="Calibri" w:cs="Calibri" w:eastAsia="Calibri" w:hAnsi="Calibri"/>
+                <w:b w:val="false"/>
+                <w:bCs w:val="false"/>
+                <w:color w:val="1A1A1A"/>
+                <w:sz w:val="20"/>
+                <w:szCs w:val="20"/>
+              </w:rPr>
+              <w:t xml:space="preserve">1</w:t>
             </w:r>
           </w:p>
         </w:tc>
@@ -4467,7 +4522,7 @@
       <w:tr>
         <w:tc>
           <w:tcPr>
-            <w:tcW w:type="dxa" w:w="3744"/>
+            <w:tcW w:type="dxa" w:w="2808"/>
             <w:tcMar>
               <w:top w:type="dxa" w:w="80"/>
               <w:left w:type="dxa" w:w="120"/>
@@ -4494,6 +4549,60 @@
         </w:tc>
         <w:tc>
           <w:tcPr>
+            <w:tcW w:type="dxa" w:w="1872"/>
+            <w:tcMar>
+              <w:top w:type="dxa" w:w="80"/>
+              <w:left w:type="dxa" w:w="120"/>
+              <w:bottom w:type="dxa" w:w="80"/>
+              <w:right w:type="dxa" w:w="120"/>
+            </w:tcMar>
+          </w:tcPr>
+          <w:p>
+            <w:pPr>
+              <w:spacing w:after="0" w:line="260"/>
+            </w:pPr>
+            <w:r>
+              <w:rPr>
+                <w:rFonts w:ascii="Calibri" w:cs="Calibri" w:eastAsia="Calibri" w:hAnsi="Calibri"/>
+                <w:b w:val="false"/>
+                <w:bCs w:val="false"/>
+                <w:color w:val="1A1A1A"/>
+                <w:sz w:val="20"/>
+                <w:szCs w:val="20"/>
+              </w:rPr>
+              <w:t xml:space="preserve">6</w:t>
+            </w:r>
+          </w:p>
+        </w:tc>
+        <w:tc>
+          <w:tcPr>
+            <w:tcW w:type="dxa" w:w="1872"/>
+            <w:tcMar>
+              <w:top w:type="dxa" w:w="80"/>
+              <w:left w:type="dxa" w:w="120"/>
+              <w:bottom w:type="dxa" w:w="80"/>
+              <w:right w:type="dxa" w:w="120"/>
+            </w:tcMar>
+          </w:tcPr>
+          <w:p>
+            <w:pPr>
+              <w:spacing w:after="0" w:line="260"/>
+            </w:pPr>
+            <w:r>
+              <w:rPr>
+                <w:rFonts w:ascii="Calibri" w:cs="Calibri" w:eastAsia="Calibri" w:hAnsi="Calibri"/>
+                <w:b w:val="false"/>
+                <w:bCs w:val="false"/>
+                <w:color w:val="1A1A1A"/>
+                <w:sz w:val="20"/>
+                <w:szCs w:val="20"/>
+              </w:rPr>
+              <w:t xml:space="preserve">2</w:t>
+            </w:r>
+          </w:p>
+        </w:tc>
+        <w:tc>
+          <w:tcPr>
             <w:tcW w:type="dxa" w:w="2808"/>
             <w:tcMar>
               <w:top w:type="dxa" w:w="80"/>
@@ -4515,34 +4624,7 @@
                 <w:sz w:val="20"/>
                 <w:szCs w:val="20"/>
               </w:rPr>
-              <w:t xml:space="preserve">6</w:t>
-            </w:r>
-          </w:p>
-        </w:tc>
-        <w:tc>
-          <w:tcPr>
-            <w:tcW w:type="dxa" w:w="2808"/>
-            <w:tcMar>
-              <w:top w:type="dxa" w:w="80"/>
-              <w:left w:type="dxa" w:w="120"/>
-              <w:bottom w:type="dxa" w:w="80"/>
-              <w:right w:type="dxa" w:w="120"/>
-            </w:tcMar>
-          </w:tcPr>
-          <w:p>
-            <w:pPr>
-              <w:spacing w:after="0" w:line="260"/>
-            </w:pPr>
-            <w:r>
-              <w:rPr>
-                <w:rFonts w:ascii="Calibri" w:cs="Calibri" w:eastAsia="Calibri" w:hAnsi="Calibri"/>
-                <w:b w:val="false"/>
-                <w:bCs w:val="false"/>
-                <w:color w:val="1A1A1A"/>
-                <w:sz w:val="20"/>
-                <w:szCs w:val="20"/>
-              </w:rPr>
-              <w:t xml:space="preserve">2</w:t>
+              <w:t xml:space="preserve">1</w:t>
             </w:r>
           </w:p>
         </w:tc>
@@ -4550,7 +4632,7 @@
       <w:tr>
         <w:tc>
           <w:tcPr>
-            <w:tcW w:type="dxa" w:w="3744"/>
+            <w:tcW w:type="dxa" w:w="2808"/>
             <w:tcMar>
               <w:top w:type="dxa" w:w="80"/>
               <w:left w:type="dxa" w:w="120"/>
@@ -4577,6 +4659,60 @@
         </w:tc>
         <w:tc>
           <w:tcPr>
+            <w:tcW w:type="dxa" w:w="1872"/>
+            <w:tcMar>
+              <w:top w:type="dxa" w:w="80"/>
+              <w:left w:type="dxa" w:w="120"/>
+              <w:bottom w:type="dxa" w:w="80"/>
+              <w:right w:type="dxa" w:w="120"/>
+            </w:tcMar>
+          </w:tcPr>
+          <w:p>
+            <w:pPr>
+              <w:spacing w:after="0" w:line="260"/>
+            </w:pPr>
+            <w:r>
+              <w:rPr>
+                <w:rFonts w:ascii="Calibri" w:cs="Calibri" w:eastAsia="Calibri" w:hAnsi="Calibri"/>
+                <w:b w:val="false"/>
+                <w:bCs w:val="false"/>
+                <w:color w:val="1A1A1A"/>
+                <w:sz w:val="20"/>
+                <w:szCs w:val="20"/>
+              </w:rPr>
+              <w:t xml:space="preserve">9</w:t>
+            </w:r>
+          </w:p>
+        </w:tc>
+        <w:tc>
+          <w:tcPr>
+            <w:tcW w:type="dxa" w:w="1872"/>
+            <w:tcMar>
+              <w:top w:type="dxa" w:w="80"/>
+              <w:left w:type="dxa" w:w="120"/>
+              <w:bottom w:type="dxa" w:w="80"/>
+              <w:right w:type="dxa" w:w="120"/>
+            </w:tcMar>
+          </w:tcPr>
+          <w:p>
+            <w:pPr>
+              <w:spacing w:after="0" w:line="260"/>
+            </w:pPr>
+            <w:r>
+              <w:rPr>
+                <w:rFonts w:ascii="Calibri" w:cs="Calibri" w:eastAsia="Calibri" w:hAnsi="Calibri"/>
+                <w:b w:val="false"/>
+                <w:bCs w:val="false"/>
+                <w:color w:val="1A1A1A"/>
+                <w:sz w:val="20"/>
+                <w:szCs w:val="20"/>
+              </w:rPr>
+              <w:t xml:space="preserve">9</w:t>
+            </w:r>
+          </w:p>
+        </w:tc>
+        <w:tc>
+          <w:tcPr>
             <w:tcW w:type="dxa" w:w="2808"/>
             <w:tcMar>
               <w:top w:type="dxa" w:w="80"/>
@@ -4598,34 +4734,7 @@
                 <w:sz w:val="20"/>
                 <w:szCs w:val="20"/>
               </w:rPr>
-              <w:t xml:space="preserve">9</w:t>
-            </w:r>
-          </w:p>
-        </w:tc>
-        <w:tc>
-          <w:tcPr>
-            <w:tcW w:type="dxa" w:w="2808"/>
-            <w:tcMar>
-              <w:top w:type="dxa" w:w="80"/>
-              <w:left w:type="dxa" w:w="120"/>
-              <w:bottom w:type="dxa" w:w="80"/>
-              <w:right w:type="dxa" w:w="120"/>
-            </w:tcMar>
-          </w:tcPr>
-          <w:p>
-            <w:pPr>
-              <w:spacing w:after="0" w:line="260"/>
-            </w:pPr>
-            <w:r>
-              <w:rPr>
-                <w:rFonts w:ascii="Calibri" w:cs="Calibri" w:eastAsia="Calibri" w:hAnsi="Calibri"/>
-                <w:b w:val="false"/>
-                <w:bCs w:val="false"/>
-                <w:color w:val="1A1A1A"/>
-                <w:sz w:val="20"/>
-                <w:szCs w:val="20"/>
-              </w:rPr>
-              <w:t xml:space="preserve">9</w:t>
+              <w:t xml:space="preserve">4</w:t>
             </w:r>
           </w:p>
         </w:tc>
@@ -4633,7 +4742,7 @@
       <w:tr>
         <w:tc>
           <w:tcPr>
-            <w:tcW w:type="dxa" w:w="3744"/>
+            <w:tcW w:type="dxa" w:w="2808"/>
             <w:tcMar>
               <w:top w:type="dxa" w:w="80"/>
               <w:left w:type="dxa" w:w="120"/>
@@ -4660,6 +4769,60 @@
         </w:tc>
         <w:tc>
           <w:tcPr>
+            <w:tcW w:type="dxa" w:w="1872"/>
+            <w:tcMar>
+              <w:top w:type="dxa" w:w="80"/>
+              <w:left w:type="dxa" w:w="120"/>
+              <w:bottom w:type="dxa" w:w="80"/>
+              <w:right w:type="dxa" w:w="120"/>
+            </w:tcMar>
+          </w:tcPr>
+          <w:p>
+            <w:pPr>
+              <w:spacing w:after="0" w:line="260"/>
+            </w:pPr>
+            <w:r>
+              <w:rPr>
+                <w:rFonts w:ascii="Calibri" w:cs="Calibri" w:eastAsia="Calibri" w:hAnsi="Calibri"/>
+                <w:b w:val="false"/>
+                <w:bCs w:val="false"/>
+                <w:color w:val="1A1A1A"/>
+                <w:sz w:val="20"/>
+                <w:szCs w:val="20"/>
+              </w:rPr>
+              <w:t xml:space="preserve">18</w:t>
+            </w:r>
+          </w:p>
+        </w:tc>
+        <w:tc>
+          <w:tcPr>
+            <w:tcW w:type="dxa" w:w="1872"/>
+            <w:tcMar>
+              <w:top w:type="dxa" w:w="80"/>
+              <w:left w:type="dxa" w:w="120"/>
+              <w:bottom w:type="dxa" w:w="80"/>
+              <w:right w:type="dxa" w:w="120"/>
+            </w:tcMar>
+          </w:tcPr>
+          <w:p>
+            <w:pPr>
+              <w:spacing w:after="0" w:line="260"/>
+            </w:pPr>
+            <w:r>
+              <w:rPr>
+                <w:rFonts w:ascii="Calibri" w:cs="Calibri" w:eastAsia="Calibri" w:hAnsi="Calibri"/>
+                <w:b w:val="false"/>
+                <w:bCs w:val="false"/>
+                <w:color w:val="1A1A1A"/>
+                <w:sz w:val="20"/>
+                <w:szCs w:val="20"/>
+              </w:rPr>
+              <w:t xml:space="preserve">12</w:t>
+            </w:r>
+          </w:p>
+        </w:tc>
+        <w:tc>
+          <w:tcPr>
             <w:tcW w:type="dxa" w:w="2808"/>
             <w:tcMar>
               <w:top w:type="dxa" w:w="80"/>
@@ -4681,34 +4844,7 @@
                 <w:sz w:val="20"/>
                 <w:szCs w:val="20"/>
               </w:rPr>
-              <w:t xml:space="preserve">18</w:t>
-            </w:r>
-          </w:p>
-        </w:tc>
-        <w:tc>
-          <w:tcPr>
-            <w:tcW w:type="dxa" w:w="2808"/>
-            <w:tcMar>
-              <w:top w:type="dxa" w:w="80"/>
-              <w:left w:type="dxa" w:w="120"/>
-              <w:bottom w:type="dxa" w:w="80"/>
-              <w:right w:type="dxa" w:w="120"/>
-            </w:tcMar>
-          </w:tcPr>
-          <w:p>
-            <w:pPr>
-              <w:spacing w:after="0" w:line="260"/>
-            </w:pPr>
-            <w:r>
-              <w:rPr>
-                <w:rFonts w:ascii="Calibri" w:cs="Calibri" w:eastAsia="Calibri" w:hAnsi="Calibri"/>
-                <w:b w:val="false"/>
-                <w:bCs w:val="false"/>
-                <w:color w:val="1A1A1A"/>
-                <w:sz w:val="20"/>
-                <w:szCs w:val="20"/>
-              </w:rPr>
-              <w:t xml:space="preserve">12</w:t>
+              <w:t xml:space="preserve">6</w:t>
             </w:r>
           </w:p>
         </w:tc>
@@ -4811,7 +4947,36 @@
           <w:sz w:val="21"/>
           <w:szCs w:val="21"/>
         </w:rPr>
-        <w:t xml:space="preserve">Los hallazgos restantes de riesgo bajo e informativo son falsos positivos originados en dependencias de terceros: secuencias numéricas dentro del código empaquetado que un detector interpreta como marcas de tiempo, y un mensaje de error de una biblioteca de validación que contiene la palabra «bug».</w:t>
+        <w:t xml:space="preserve">Los hallazgos restantes de riesgo bajo e informativo son falsos positivos originados en dependencias de terceros: secuencias numéricas dentro del código empaquetado que un detector interpreta como marcas de tiempo, y comentarios del código empaquetado que un detector marca como sospechosos.</w:t>
+      </w:r>
+    </w:p>
+    <w:p>
+      <w:pPr>
+        <w:spacing w:after="120" w:line="276"/>
+      </w:pPr>
+      <w:r>
+        <w:rPr>
+          <w:rFonts w:ascii="Calibri" w:cs="Calibri" w:eastAsia="Calibri" w:hAnsi="Calibri"/>
+          <w:b/>
+          <w:bCs/>
+          <w:color w:val="1A1A1A"/>
+          <w:sz w:val="21"/>
+          <w:szCs w:val="21"/>
+        </w:rPr>
+        <w:t xml:space="preserve">Triaje final. </w:t>
+      </w:r>
+      <w:r>
+        <w:rPr>
+          <w:rFonts w:ascii="Calibri" w:cs="Calibri" w:eastAsia="Calibri" w:hAnsi="Calibri"/>
+          <w:b w:val="false"/>
+          <w:bCs w:val="false"/>
+          <w:i w:val="false"/>
+          <w:iCs w:val="false"/>
+          <w:color w:val="1A1A1A"/>
+          <w:sz w:val="21"/>
+          <w:szCs w:val="21"/>
+        </w:rPr>
+        <w:t xml:space="preserve">Los seis hallazgos que permanecen están revisados uno a uno, y cada decisión lleva escrito su motivo junto a la regla que la aplica. Silenciar un aviso sin dejar constancia del porqué es, a efectos prácticos, indistinguible de esconderlo: quien lea el archivo dentro de seis meses no podrá saber si se estudió o si se acalló. El hallazgo de riesgo medio se mantiene deliberadamente en estado de aviso —no silenciado— para que siga apareciendo en cada informe mientras la limitación técnica que lo causa siga vigente.</w:t>
       </w:r>
     </w:p>
     <w:p>
@@ -4988,7 +5153,7 @@
           <w:sz w:val="24"/>
           <w:szCs w:val="24"/>
         </w:rPr>
-        <w:t xml:space="preserve">5.4 La configuración por defecto rara vez es la adecuada</w:t>
+        <w:t xml:space="preserve">5.4 Medir antes que deducir</w:t>
       </w:r>
     </w:p>
     <w:p>
@@ -5002,7 +5167,35 @@
           <w:sz w:val="21"/>
           <w:szCs w:val="21"/>
         </w:rPr>
-        <w:t xml:space="preserve">Las incidencias que más tiempo consumieron no fueron de programación, sino de configuración: un perfil de compilación al que le faltaba una clave, un análisis automático que ignoraba las exclusiones, una regla que clasificaba mal los archivos de prueba, un enlace de proyecto ausente en la herramienta de base de datos. Todas se comportaban silenciosamente: no fallaban, producían resultados incorrectos.</w:t>
+        <w:t xml:space="preserve">El fallo que más tiempo consumió en todo el proyecto fue un modo claro que, en el emulador de Expo Go sobre Android, mostraba la interfaz a medias: las imágenes cambiaban al juego claro y los fondos seguían oscuros. Se formularon y descartaron tres explicaciones sucesivas —una caché de imágenes, un compilador que memoiza de más, una barra de pestañas nativa que no propaga el repintado— y cada una consumió trabajo antes de descartarse.</w:t>
+      </w:r>
+    </w:p>
+    <w:p>
+      <w:pPr>
+        <w:spacing w:after="120" w:line="276"/>
+      </w:pPr>
+      <w:r>
+        <w:rPr>
+          <w:rFonts w:ascii="Calibri" w:cs="Calibri" w:eastAsia="Calibri" w:hAnsi="Calibri"/>
+          <w:color w:val="1A1A1A"/>
+          <w:sz w:val="21"/>
+          <w:szCs w:val="21"/>
+        </w:rPr>
+        <w:t xml:space="preserve">La causa real apareció al instrumentar la aplicación para que registrase, en cada render, qué color estaba pidiendo. El registro mostró que pedía exactamente los colores claros correctos. Es decir: el programa funcionaba y era el sistema operativo quien lo alteraba. Android aplica una inversión automática de colores a las aplicaciones que no declaran soportar tema oscuro, y dentro de un contenedor de desarrollo se hereda la configuración de ese contenedor, no la de la aplicación propia. En una compilación firmada el problema no existe, lo que se verificó generando el proyecto nativo y leyendo el tema declarado.</w:t>
+      </w:r>
+    </w:p>
+    <w:p>
+      <w:pPr>
+        <w:spacing w:after="120" w:line="276"/>
+      </w:pPr>
+      <w:r>
+        <w:rPr>
+          <w:rFonts w:ascii="Calibri" w:cs="Calibri" w:eastAsia="Calibri" w:hAnsi="Calibri"/>
+          <w:color w:val="1A1A1A"/>
+          <w:sz w:val="21"/>
+          <w:szCs w:val="21"/>
+        </w:rPr>
+        <w:t xml:space="preserve">La lección no es sobre temas de color. Es que tres hipótesis razonables, encadenadas, costaron más que la media hora de instrumentar y leer un valor. Ante un comportamiento que contradice lo que el código dice hacer, medir primero y deducir después; y ante una diferencia entre plataformas, sospechar del entorno antes que del programa.</w:t>
       </w:r>
     </w:p>
     <w:p>
@@ -5019,7 +5212,38 @@
           <w:sz w:val="24"/>
           <w:szCs w:val="24"/>
         </w:rPr>
-        <w:t xml:space="preserve">5.5 Documentar la decisión, no solo el resultado</w:t>
+        <w:t xml:space="preserve">5.5 La configuración por defecto rara vez es la adecuada</w:t>
+      </w:r>
+    </w:p>
+    <w:p>
+      <w:pPr>
+        <w:spacing w:after="120" w:line="276"/>
+      </w:pPr>
+      <w:r>
+        <w:rPr>
+          <w:rFonts w:ascii="Calibri" w:cs="Calibri" w:eastAsia="Calibri" w:hAnsi="Calibri"/>
+          <w:color w:val="1A1A1A"/>
+          <w:sz w:val="21"/>
+          <w:szCs w:val="21"/>
+        </w:rPr>
+        <w:t xml:space="preserve">Las incidencias que más tiempo consumieron no fueron de programación, sino de configuración: un perfil de compilación al que le faltaba una clave, un análisis automático que ignoraba las exclusiones, una regla que clasificaba mal los archivos de prueba, un enlace de proyecto ausente en la herramienta de base de datos. Todas se comportaban silenciosamente: no fallaban, producían resultados incorrectos.</w:t>
+      </w:r>
+    </w:p>
+    <w:p>
+      <w:pPr>
+        <w:pStyle w:val="Heading2"/>
+        <w:spacing w:after="140" w:before="280"/>
+      </w:pPr>
+      <w:r>
+        <w:rPr>
+          <w:rFonts w:ascii="Calibri" w:cs="Calibri" w:eastAsia="Calibri" w:hAnsi="Calibri"/>
+          <w:b/>
+          <w:bCs/>
+          <w:color w:val="1A1A1A"/>
+          <w:sz w:val="24"/>
+          <w:szCs w:val="24"/>
+        </w:rPr>
+        <w:t xml:space="preserve">5.6 Documentar la decisión, no solo el resultado</w:t>
       </w:r>
     </w:p>
     <w:p>
@@ -6237,6 +6461,25 @@
           <w:sz w:val="21"/>
           <w:szCs w:val="21"/>
         </w:rPr>
+        <w:t xml:space="preserve">Ante un comportamiento que contradice el código, instrumentar y medir antes de encadenar hipótesis.</w:t>
+      </w:r>
+    </w:p>
+    <w:p>
+      <w:pPr>
+        <w:pStyle w:val="ListParagraph"/>
+        <w:numPr>
+          <w:ilvl w:val="0"/>
+          <w:numId w:val="2"/>
+        </w:numPr>
+        <w:spacing w:after="80" w:line="276"/>
+      </w:pPr>
+      <w:r>
+        <w:rPr>
+          <w:rFonts w:ascii="Calibri" w:cs="Calibri" w:eastAsia="Calibri" w:hAnsi="Calibri"/>
+          <w:color w:val="1A1A1A"/>
+          <w:sz w:val="21"/>
+          <w:szCs w:val="21"/>
+        </w:rPr>
         <w:t xml:space="preserve">Mantener el suelo de cobertura y elevarlo de forma gradual conforme se estabilicen las áreas nuevas.</w:t>
       </w:r>
     </w:p>
@@ -6550,7 +6793,7 @@
                 <w:sz w:val="20"/>
                 <w:szCs w:val="20"/>
               </w:rPr>
-              <w:t xml:space="preserve">Listado legible de las 1 342 pruebas</w:t>
+              <w:t xml:space="preserve">Listado legible de las 1 564 pruebas</w:t>
             </w:r>
           </w:p>
         </w:tc>

</xml_diff>